<commit_message>
Update and add resume/CV files
Add Resume.docx and a new PDF (Ubaid CV 4-4-26.pdf); update Ubaid CV.docx; remove the old Ubaid CV.pdf and add Ubaid.pdf. Refreshes CV/resume files across DOCX and PDF formats.
</commit_message>
<xml_diff>
--- a/Ubaid CV.docx
+++ b/Ubaid CV.docx
@@ -80,23 +80,7 @@
                   <w:rFonts w:eastAsiaTheme="majorEastAsia"/>
                   <w:spacing w:val="-2"/>
                 </w:rPr>
-                <w:t>Linke</w:t>
-              </w:r>
-              <w:r>
-                <w:rPr>
-                  <w:rStyle w:val="Hyperlink"/>
-                  <w:rFonts w:eastAsiaTheme="majorEastAsia"/>
-                  <w:spacing w:val="-2"/>
-                </w:rPr>
-                <w:t>d</w:t>
-              </w:r>
-              <w:r>
-                <w:rPr>
-                  <w:rStyle w:val="Hyperlink"/>
-                  <w:rFonts w:eastAsiaTheme="majorEastAsia"/>
-                  <w:spacing w:val="-2"/>
-                </w:rPr>
-                <w:t>in</w:t>
+                <w:t>Linkedin</w:t>
               </w:r>
               <w:proofErr w:type="spellEnd"/>
             </w:hyperlink>
@@ -361,13 +345,7 @@
         <w:jc w:val="both"/>
       </w:pPr>
       <w:r>
-        <w:t xml:space="preserve">Motivated and adaptable Computer Science undergraduate at SZABIST University Islamabad (2025–Present) with a solid foundation in </w:t>
-      </w:r>
-      <w:r>
-        <w:t>Programming</w:t>
-      </w:r>
-      <w:r>
-        <w:t>, problem-solving, and collaborative teamwork. Experienced in thriving in diverse environments and working across disciplines, with a proven ability to take ownership of tasks, perform under pressure, and manage time efficiently through proactive planning and organization. Passionate about continuous</w:t>
+        <w:t>Full Stack Engineer specializing in scalable backend systems, automation workflows, and cloud infrastructure. Experienced in designing secure REST APIs, implementing role-based authentication, and deploying production-ready applications on AWS. Strong focus on performance optimization, system reliability, and end-to-end ownership from architecture to deployment</w:t>
       </w:r>
       <w:r>
         <w:t>.</w:t>
@@ -656,26 +634,13 @@
           <w:spacing w:val="-10"/>
           <w:sz w:val="24"/>
         </w:rPr>
-        <w:t>Programming Fundamentals,</w:t>
-      </w:r>
-      <w:r>
-        <w:rPr>
-          <w:sz w:val="24"/>
-        </w:rPr>
-        <w:t xml:space="preserve"> </w:t>
+        <w:t>Data Structures &amp; Algorithms, Operating Systems, OOP, Database Management Systems, Software Engineering, Artificial Intelligence,</w:t>
       </w:r>
       <w:r>
         <w:rPr>
           <w:spacing w:val="-10"/>
           <w:sz w:val="24"/>
         </w:rPr>
-        <w:t>Operating Systems, Software</w:t>
-      </w:r>
-      <w:r>
-        <w:rPr>
-          <w:spacing w:val="-12"/>
-          <w:sz w:val="24"/>
-        </w:rPr>
         <w:t xml:space="preserve"> </w:t>
       </w:r>
       <w:r>
@@ -683,172 +648,18 @@
           <w:spacing w:val="-10"/>
           <w:sz w:val="24"/>
         </w:rPr>
-        <w:t>Project Management,</w:t>
-      </w:r>
-      <w:r>
-        <w:rPr>
-          <w:spacing w:val="-13"/>
+        <w:t>Web Developmen</w:t>
+      </w:r>
+      <w:r>
+        <w:rPr>
+          <w:spacing w:val="-10"/>
           <w:sz w:val="24"/>
         </w:rPr>
-        <w:t xml:space="preserve"> </w:t>
-      </w:r>
-      <w:r>
-        <w:rPr>
-          <w:spacing w:val="-10"/>
-        </w:rPr>
-        <w:t xml:space="preserve">Object-Oriented </w:t>
-      </w:r>
-      <w:r>
-        <w:t>Programming</w:t>
-      </w:r>
-      <w:r>
-        <w:rPr>
-          <w:spacing w:val="-22"/>
-        </w:rPr>
-        <w:t xml:space="preserve"> </w:t>
-      </w:r>
-      <w:r>
-        <w:t>(OOP)</w:t>
-      </w:r>
-      <w:r>
-        <w:rPr>
-          <w:sz w:val="24"/>
-          <w:szCs w:val="24"/>
-        </w:rPr>
-        <w:t xml:space="preserve">, </w:t>
-      </w:r>
-      <w:r>
-        <w:t>Database Management Systems, Web Development, Cloud Computing &amp; AWS, Software Engineering</w:t>
-      </w:r>
-      <w:r>
-        <w:t xml:space="preserve">, </w:t>
-      </w:r>
-      <w:r>
-        <w:t>Artificial Intelligence &amp; Machine Learning, Data Structures &amp; Algorithms</w:t>
+        <w:t>t, Android App Development</w:t>
       </w:r>
       <w:r>
         <w:t>.</w:t>
       </w:r>
-    </w:p>
-    <w:p>
-      <w:pPr>
-        <w:tabs>
-          <w:tab w:val="left" w:pos="720"/>
-        </w:tabs>
-        <w:spacing w:line="276" w:lineRule="auto"/>
-        <w:ind w:right="709"/>
-        <w:jc w:val="both"/>
-        <w:rPr>
-          <w:sz w:val="8"/>
-          <w:szCs w:val="6"/>
-        </w:rPr>
-      </w:pPr>
-    </w:p>
-    <w:tbl>
-      <w:tblPr>
-        <w:tblStyle w:val="TableGrid"/>
-        <w:tblW w:w="0" w:type="auto"/>
-        <w:tblBorders>
-          <w:top w:val="none" w:sz="0" w:space="0" w:color="auto"/>
-          <w:left w:val="none" w:sz="0" w:space="0" w:color="auto"/>
-          <w:bottom w:val="none" w:sz="0" w:space="0" w:color="auto"/>
-          <w:right w:val="none" w:sz="0" w:space="0" w:color="auto"/>
-          <w:insideH w:val="none" w:sz="0" w:space="0" w:color="auto"/>
-          <w:insideV w:val="none" w:sz="0" w:space="0" w:color="auto"/>
-        </w:tblBorders>
-        <w:tblLook w:val="04A0" w:firstRow="1" w:lastRow="0" w:firstColumn="1" w:lastColumn="0" w:noHBand="0" w:noVBand="1"/>
-      </w:tblPr>
-      <w:tblGrid>
-        <w:gridCol w:w="5241"/>
-        <w:gridCol w:w="5225"/>
-      </w:tblGrid>
-      <w:tr>
-        <w:tc>
-          <w:tcPr>
-            <w:tcW w:w="5508" w:type="dxa"/>
-            <w:vAlign w:val="center"/>
-          </w:tcPr>
-          <w:p>
-            <w:pPr>
-              <w:tabs>
-                <w:tab w:val="left" w:pos="9522"/>
-              </w:tabs>
-              <w:spacing w:before="9"/>
-              <w:rPr>
-                <w:b/>
-              </w:rPr>
-            </w:pPr>
-            <w:r>
-              <w:rPr>
-                <w:b/>
-                <w:spacing w:val="-2"/>
-              </w:rPr>
-              <w:t>Intermediate (FSC. General Science)</w:t>
-            </w:r>
-          </w:p>
-        </w:tc>
-        <w:tc>
-          <w:tcPr>
-            <w:tcW w:w="5508" w:type="dxa"/>
-            <w:vAlign w:val="center"/>
-          </w:tcPr>
-          <w:p>
-            <w:pPr>
-              <w:tabs>
-                <w:tab w:val="left" w:pos="9522"/>
-              </w:tabs>
-              <w:spacing w:before="9"/>
-              <w:jc w:val="right"/>
-              <w:rPr>
-                <w:b/>
-              </w:rPr>
-            </w:pPr>
-            <w:r>
-              <w:rPr>
-                <w:spacing w:val="-2"/>
-              </w:rPr>
-              <w:t>Islamabad</w:t>
-            </w:r>
-            <w:r>
-              <w:rPr>
-                <w:spacing w:val="-4"/>
-              </w:rPr>
-              <w:t>,</w:t>
-            </w:r>
-            <w:r>
-              <w:rPr>
-                <w:spacing w:val="5"/>
-              </w:rPr>
-              <w:t xml:space="preserve"> </w:t>
-            </w:r>
-            <w:r>
-              <w:rPr>
-                <w:spacing w:val="-2"/>
-              </w:rPr>
-              <w:t>Pakistan</w:t>
-            </w:r>
-          </w:p>
-        </w:tc>
-      </w:tr>
-    </w:tbl>
-    <w:p>
-      <w:pPr>
-        <w:pStyle w:val="BodyText"/>
-        <w:numPr>
-          <w:ilvl w:val="0"/>
-          <w:numId w:val="8"/>
-        </w:numPr>
-        <w:jc w:val="both"/>
-      </w:pPr>
-      <w:r>
-        <w:t>Islamabad Model Postgraduate College H-8, Islamabad.</w:t>
-      </w:r>
-    </w:p>
-    <w:p>
-      <w:pPr>
-        <w:pStyle w:val="BodyText"/>
-        <w:jc w:val="both"/>
-      </w:pPr>
     </w:p>
     <w:tbl>
       <w:tblPr>
@@ -1002,7 +813,14 @@
           <w:i/>
           <w:sz w:val="24"/>
         </w:rPr>
-        <w:t>Full Stack Developer</w:t>
+        <w:t xml:space="preserve">Full Stack </w:t>
+      </w:r>
+      <w:r>
+        <w:rPr>
+          <w:i/>
+          <w:sz w:val="24"/>
+        </w:rPr>
+        <w:t>Engineer</w:t>
       </w:r>
     </w:p>
     <w:p>
@@ -1014,7 +832,10 @@
         </w:numPr>
       </w:pPr>
       <w:r>
-        <w:t>Designed AI-powered automation systems and REST APIs.</w:t>
+        <w:t>Architected AI-powered automation systems and scalable REST APIs serving production workflows</w:t>
+      </w:r>
+      <w:r>
+        <w:t>.</w:t>
       </w:r>
     </w:p>
     <w:p>
@@ -1026,7 +847,10 @@
         </w:numPr>
       </w:pPr>
       <w:r>
-        <w:t>Managed AWS EC2 deployment, Nginx setup, SSL, DNS, and PM2 configuration.</w:t>
+        <w:t>Owned full production deployment on AWS (EC2, Nginx, SSL, PM2) with security hardening and monitoring</w:t>
+      </w:r>
+      <w:r>
+        <w:t>.</w:t>
       </w:r>
     </w:p>
     <w:p>
@@ -1136,7 +960,13 @@
         <w:rPr>
           <w:i/>
         </w:rPr>
-        <w:t>Full Stack Developer</w:t>
+        <w:t xml:space="preserve">Full Stack </w:t>
+      </w:r>
+      <w:r>
+        <w:rPr>
+          <w:i/>
+        </w:rPr>
+        <w:t>Engineer</w:t>
       </w:r>
     </w:p>
     <w:p>
@@ -1461,12 +1291,21 @@
           <w:bCs/>
         </w:rPr>
       </w:pPr>
+      <w:proofErr w:type="spellStart"/>
       <w:r>
         <w:rPr>
           <w:b/>
           <w:bCs/>
         </w:rPr>
-        <w:t>Online Doctor Appointment System</w:t>
+        <w:t>Reroom</w:t>
+      </w:r>
+      <w:proofErr w:type="spellEnd"/>
+      <w:r>
+        <w:rPr>
+          <w:b/>
+          <w:bCs/>
+        </w:rPr>
+        <w:t xml:space="preserve"> Ai </w:t>
       </w:r>
     </w:p>
     <w:p>
@@ -1477,7 +1316,32 @@
         <w:jc w:val="both"/>
       </w:pPr>
       <w:r>
-        <w:t>Developed a web-based platform enabling patients to book appointments with doctors based on availability and specialization. Included user authentication, appointment scheduling, and admin panel for clinic management.</w:t>
+        <w:t xml:space="preserve">AI-powered interior redesign platform that transforms uploaded room images into multiple styles (modern, natural, custom prompts) using ChatGPT and </w:t>
+      </w:r>
+      <w:proofErr w:type="spellStart"/>
+      <w:r>
+        <w:t>Replit</w:t>
+      </w:r>
+      <w:proofErr w:type="spellEnd"/>
+      <w:r>
+        <w:t xml:space="preserve"> APIs.</w:t>
+      </w:r>
+      <w:r>
+        <w:t xml:space="preserve"> </w:t>
+      </w:r>
+      <w:r>
+        <w:t xml:space="preserve">Implemented credit-based generation system with payment integration and </w:t>
+      </w:r>
+      <w:proofErr w:type="spellStart"/>
+      <w:r>
+        <w:t>Supabase</w:t>
+      </w:r>
+      <w:proofErr w:type="spellEnd"/>
+      <w:r>
+        <w:t xml:space="preserve"> backend for secure user management</w:t>
+      </w:r>
+      <w:r>
+        <w:t>.</w:t>
       </w:r>
     </w:p>
     <w:p>
@@ -1491,21 +1355,12 @@
           <w:bCs/>
         </w:rPr>
       </w:pPr>
-      <w:proofErr w:type="spellStart"/>
       <w:r>
         <w:rPr>
           <w:b/>
           <w:bCs/>
         </w:rPr>
-        <w:t>Gixiai</w:t>
-      </w:r>
-      <w:proofErr w:type="spellEnd"/>
-      <w:r>
-        <w:rPr>
-          <w:b/>
-          <w:bCs/>
-        </w:rPr>
-        <w:t xml:space="preserve"> Website</w:t>
+        <w:t>Real Estate Lead Management System</w:t>
       </w:r>
     </w:p>
     <w:p>
@@ -1516,7 +1371,13 @@
         <w:jc w:val="both"/>
       </w:pPr>
       <w:r>
-        <w:t>Developed a web-based platform enabling patients to book appointments with doctors based on availability and specialization. Included user authentication, appointment scheduling, and admin panel for clinic management.</w:t>
+        <w:t>Enterprise-grade Property Management System for handling listings, tenants, rent tracking, and landlord reporting with secure role-based access.</w:t>
+      </w:r>
+      <w:r>
+        <w:t xml:space="preserve"> </w:t>
+      </w:r>
+      <w:r>
+        <w:t>Built and deployed full-stack solution with automated billing, operational dashboards, and cloud infrastructure setup.</w:t>
       </w:r>
     </w:p>
     <w:p>
@@ -1530,16 +1391,13 @@
           <w:bCs/>
         </w:rPr>
       </w:pPr>
-      <w:proofErr w:type="spellStart"/>
       <w:r>
         <w:rPr>
           <w:b/>
           <w:bCs/>
         </w:rPr>
-        <w:lastRenderedPageBreak/>
-        <w:t>Traydia</w:t>
-      </w:r>
-      <w:proofErr w:type="spellEnd"/>
+        <w:t>Contractor Website</w:t>
+      </w:r>
     </w:p>
     <w:p>
       <w:pPr>
@@ -1549,7 +1407,19 @@
         <w:jc w:val="both"/>
       </w:pPr>
       <w:r>
-        <w:t>Built a smart lighting system using sensors and microcontrollers to detect room occupancy and control lights automatically, improving energy efficiency and user convenience.</w:t>
+        <w:t>Service management platform enabling contractors to manage renovation projects, invoices, scheduling, and client</w:t>
+      </w:r>
+      <w:r>
+        <w:t xml:space="preserve"> </w:t>
+      </w:r>
+      <w:r>
+        <w:t>communication.</w:t>
+      </w:r>
+      <w:r>
+        <w:t xml:space="preserve"> </w:t>
+      </w:r>
+      <w:r>
+        <w:t>Designed backend APIs (Node.js &amp; Java), authentication system, analytics dashboard, and handled complete production deployment.</w:t>
       </w:r>
     </w:p>
     <w:p>
@@ -1564,22 +1434,21 @@
         </w:rPr>
       </w:pPr>
       <w:proofErr w:type="spellStart"/>
-      <w:proofErr w:type="gramStart"/>
       <w:r>
         <w:rPr>
           <w:b/>
           <w:bCs/>
         </w:rPr>
-        <w:t>Lets</w:t>
+        <w:lastRenderedPageBreak/>
+        <w:t>Gixiai</w:t>
       </w:r>
       <w:proofErr w:type="spellEnd"/>
-      <w:proofErr w:type="gramEnd"/>
       <w:r>
         <w:rPr>
           <w:b/>
           <w:bCs/>
         </w:rPr>
-        <w:t xml:space="preserve"> Fix Home</w:t>
+        <w:t xml:space="preserve"> Website</w:t>
       </w:r>
     </w:p>
     <w:p>
@@ -1590,7 +1459,13 @@
         <w:jc w:val="both"/>
       </w:pPr>
       <w:r>
-        <w:t>Created a system to track stock levels, manage product details, and generate alerts for low inventory. Enabled real-time updates for sales, purchases, and inventory reports to streamline store operations.</w:t>
+        <w:t>Fully dynamic Next.js website featuring blogs, portfolio management, admin panel, and notification system with complete CRUD operations.</w:t>
+      </w:r>
+      <w:r>
+        <w:t xml:space="preserve"> </w:t>
+      </w:r>
+      <w:r>
+        <w:t>Built from scratch and deployed on VPS with custom server configuration and optimized frontend performance.</w:t>
       </w:r>
     </w:p>
     <w:p>
@@ -1605,20 +1480,22 @@
         </w:rPr>
       </w:pPr>
       <w:proofErr w:type="spellStart"/>
+      <w:proofErr w:type="gramStart"/>
       <w:r>
         <w:rPr>
           <w:b/>
           <w:bCs/>
         </w:rPr>
-        <w:t>Reroom</w:t>
+        <w:t>Lets</w:t>
       </w:r>
       <w:proofErr w:type="spellEnd"/>
+      <w:proofErr w:type="gramEnd"/>
       <w:r>
         <w:rPr>
           <w:b/>
           <w:bCs/>
         </w:rPr>
-        <w:t xml:space="preserve"> Ai </w:t>
+        <w:t xml:space="preserve"> Fix Home</w:t>
       </w:r>
     </w:p>
     <w:p>
@@ -1629,15 +1506,27 @@
         <w:jc w:val="both"/>
       </w:pPr>
       <w:r>
-        <w:t>Developed a web-based platform enabling patients to book appointments with doctors based on availability and specialization. Included user authentication, appointment scheduling, and admin panel for clinic management.</w:t>
-      </w:r>
-    </w:p>
-    <w:p>
-      <w:pPr>
-        <w:pStyle w:val="BodyText"/>
-        <w:spacing w:before="240" w:line="237" w:lineRule="auto"/>
+        <w:t>Developed a company service platform supporting automation-driven service workflows and Jania bot integrations.</w:t>
+      </w:r>
+      <w:r>
+        <w:t xml:space="preserve"> </w:t>
+      </w:r>
+      <w:r>
+        <w:t>Designed scalable backend structure and deployed production-ready web infrastructure.</w:t>
+      </w:r>
+    </w:p>
+    <w:p>
+      <w:pPr>
+        <w:pStyle w:val="BodyText"/>
+        <w:spacing w:line="237" w:lineRule="auto"/>
         <w:ind w:right="318"/>
-        <w:jc w:val="both"/>
+      </w:pPr>
+    </w:p>
+    <w:p>
+      <w:pPr>
+        <w:pStyle w:val="BodyText"/>
+        <w:spacing w:after="240" w:line="237" w:lineRule="auto"/>
+        <w:ind w:right="318"/>
         <w:rPr>
           <w:b/>
           <w:bCs/>
@@ -1648,254 +1537,28 @@
           <w:b/>
           <w:bCs/>
         </w:rPr>
-        <w:t>E-commerce Furniture Store</w:t>
-      </w:r>
-    </w:p>
-    <w:p>
-      <w:pPr>
-        <w:pStyle w:val="BodyText"/>
-        <w:spacing w:before="240" w:line="237" w:lineRule="auto"/>
-        <w:ind w:left="720" w:right="318"/>
-        <w:jc w:val="both"/>
-      </w:pPr>
-      <w:r>
-        <w:t>Built a smart lighting system using sensors and microcontrollers to detect room occupancy and control lights automatically, improving energy efficiency and user convenience.</w:t>
-      </w:r>
-    </w:p>
-    <w:p>
-      <w:pPr>
-        <w:pStyle w:val="BodyText"/>
-        <w:spacing w:before="240" w:line="237" w:lineRule="auto"/>
-        <w:ind w:right="318"/>
-        <w:jc w:val="both"/>
+        <w:t xml:space="preserve">Automation </w:t>
+      </w:r>
+      <w:r>
         <w:rPr>
           <w:b/>
           <w:bCs/>
         </w:rPr>
-      </w:pPr>
+        <w:t xml:space="preserve">&amp; </w:t>
+      </w:r>
       <w:r>
         <w:rPr>
           <w:b/>
           <w:bCs/>
         </w:rPr>
-        <w:t>Quotes Market</w:t>
-      </w:r>
-    </w:p>
-    <w:p>
-      <w:pPr>
-        <w:pStyle w:val="BodyText"/>
-        <w:spacing w:before="240" w:line="237" w:lineRule="auto"/>
-        <w:ind w:left="720" w:right="318"/>
-        <w:jc w:val="both"/>
-      </w:pPr>
-      <w:r>
-        <w:t>Created a system to track stock levels, manage product details, and generate alerts for low inventory. Enabled real-time updates for sales, purchases, and inventory reports to streamline store operations.</w:t>
-      </w:r>
-    </w:p>
-    <w:p>
-      <w:pPr>
-        <w:pStyle w:val="BodyText"/>
-        <w:spacing w:before="240" w:line="237" w:lineRule="auto"/>
-        <w:ind w:right="318"/>
-        <w:jc w:val="both"/>
+        <w:t xml:space="preserve">Engineering </w:t>
+      </w:r>
+      <w:r>
         <w:rPr>
           <w:b/>
           <w:bCs/>
         </w:rPr>
-      </w:pPr>
-      <w:r>
-        <w:rPr>
-          <w:b/>
-          <w:bCs/>
-        </w:rPr>
-        <w:t>Contractor Website</w:t>
-      </w:r>
-    </w:p>
-    <w:p>
-      <w:pPr>
-        <w:pStyle w:val="BodyText"/>
-        <w:spacing w:before="240" w:line="237" w:lineRule="auto"/>
-        <w:ind w:left="720" w:right="318"/>
-        <w:jc w:val="both"/>
-      </w:pPr>
-      <w:r>
-        <w:t>Built a dynamic website for contractors to showcase services, provide renovation solutions, accept project requests, generate invoices, schedule appointments, and manage client communications including rate discussions and chatbot support. Developed backend and APIs using Node.js and Java, implemented a comprehensive dashboard to track project progress, analytics, and secure user authentication, and handled complete deployment with server setup, configuration, and maintenance.</w:t>
-      </w:r>
-    </w:p>
-    <w:p>
-      <w:pPr>
-        <w:pStyle w:val="BodyText"/>
-        <w:spacing w:before="240" w:line="237" w:lineRule="auto"/>
-        <w:ind w:right="318"/>
-        <w:jc w:val="both"/>
-        <w:rPr>
-          <w:b/>
-          <w:bCs/>
-        </w:rPr>
-      </w:pPr>
-      <w:r>
-        <w:rPr>
-          <w:b/>
-          <w:bCs/>
-        </w:rPr>
-        <w:t>Real Estate Lead Management System</w:t>
-      </w:r>
-    </w:p>
-    <w:p>
-      <w:pPr>
-        <w:pStyle w:val="BodyText"/>
-        <w:spacing w:before="240" w:line="237" w:lineRule="auto"/>
-        <w:ind w:left="720" w:right="318"/>
-        <w:jc w:val="both"/>
-      </w:pPr>
-      <w:r>
-        <w:t>Developed a centralized Property Management System (PMS) for Daya Properties Ltd to streamline property listings, tenant management, rent collection, and landlord reporting. Built using Node.js with secure authentication, automated billing, payment tracking, maintenance management, and operational dashboards for real-time insights. Implemented tenant and landlord portals, SEO and cloud deployment, and handled complete server setup, configuration, and security to deliver a scalable end-to-end solution.</w:t>
-      </w:r>
-    </w:p>
-    <w:p>
-      <w:pPr>
-        <w:pStyle w:val="BodyText"/>
-        <w:spacing w:before="240" w:line="237" w:lineRule="auto"/>
-        <w:ind w:right="318"/>
-        <w:jc w:val="both"/>
-        <w:rPr>
-          <w:b/>
-          <w:bCs/>
-        </w:rPr>
-      </w:pPr>
-      <w:r>
-        <w:rPr>
-          <w:b/>
-          <w:bCs/>
-        </w:rPr>
-        <w:t>HH Tech Hub Website</w:t>
-      </w:r>
-    </w:p>
-    <w:p>
-      <w:pPr>
-        <w:pStyle w:val="BodyText"/>
-        <w:spacing w:before="240" w:line="237" w:lineRule="auto"/>
-        <w:ind w:left="720" w:right="318"/>
-        <w:jc w:val="both"/>
-      </w:pPr>
-      <w:r>
-        <w:t>Created a system to track stock levels, manage product details, and generate alerts for low inventory. Enabled real-time updates for sales, purchases, and inventory reports to streamline store operations.</w:t>
-      </w:r>
-    </w:p>
-    <w:p>
-      <w:pPr>
-        <w:pStyle w:val="BodyText"/>
-        <w:spacing w:before="240" w:line="237" w:lineRule="auto"/>
-        <w:ind w:right="318"/>
-        <w:jc w:val="both"/>
-        <w:rPr>
-          <w:b/>
-          <w:bCs/>
-        </w:rPr>
-      </w:pPr>
-      <w:r>
-        <w:rPr>
-          <w:b/>
-          <w:bCs/>
-        </w:rPr>
-        <w:t>Chatting App</w:t>
-      </w:r>
-    </w:p>
-    <w:p>
-      <w:pPr>
-        <w:pStyle w:val="BodyText"/>
-        <w:spacing w:before="240" w:line="237" w:lineRule="auto"/>
-        <w:ind w:left="720" w:right="318"/>
-        <w:jc w:val="both"/>
-      </w:pPr>
-      <w:r>
-        <w:t>Developed a web-based platform enabling patients to book appointments with doctors based on availability and specialization. Included user authentication, appointment scheduling, and admin panel for clinic management.</w:t>
-      </w:r>
-    </w:p>
-    <w:p>
-      <w:pPr>
-        <w:pStyle w:val="BodyText"/>
-        <w:spacing w:before="240" w:line="237" w:lineRule="auto"/>
-        <w:ind w:right="318"/>
-        <w:jc w:val="both"/>
-        <w:rPr>
-          <w:b/>
-          <w:bCs/>
-        </w:rPr>
-      </w:pPr>
-      <w:r>
-        <w:rPr>
-          <w:b/>
-          <w:bCs/>
-        </w:rPr>
-        <w:t>AWS and DevOps Setup</w:t>
-      </w:r>
-    </w:p>
-    <w:p>
-      <w:pPr>
-        <w:pStyle w:val="BodyText"/>
-        <w:spacing w:before="240" w:line="237" w:lineRule="auto"/>
-        <w:ind w:left="720" w:right="318"/>
-        <w:jc w:val="both"/>
-      </w:pPr>
-      <w:r>
-        <w:t>Handled complete cloud infrastructure setup, including EC2 provisioning, Ubuntu server configuration, SSH management, Nginx with reverse proxy, SSL installation, and domain DNS. Managed databases (Postgres), PM2 process management, log monitoring, and automated restarts. Implemented production optimization, security headers, CORS, rate limiting, and Fail2Ban for secure and stable deployments.</w:t>
-      </w:r>
-    </w:p>
-    <w:p>
-      <w:pPr>
-        <w:pStyle w:val="BodyText"/>
-        <w:spacing w:before="240" w:line="237" w:lineRule="auto"/>
-        <w:ind w:right="318"/>
-        <w:jc w:val="both"/>
-        <w:rPr>
-          <w:b/>
-          <w:bCs/>
-        </w:rPr>
-      </w:pPr>
-      <w:r>
-        <w:rPr>
-          <w:b/>
-          <w:bCs/>
-        </w:rPr>
-        <w:t>Co-Circular Activities</w:t>
-      </w:r>
-    </w:p>
-    <w:p>
-      <w:pPr>
-        <w:pStyle w:val="BodyText"/>
-        <w:spacing w:before="240" w:line="237" w:lineRule="auto"/>
-        <w:ind w:right="318" w:firstLine="720"/>
-        <w:jc w:val="both"/>
-      </w:pPr>
-      <w:r>
-        <w:lastRenderedPageBreak/>
-        <w:t>Organizer – International Research Conference (IRC 2023).</w:t>
-      </w:r>
-    </w:p>
-    <w:p>
-      <w:pPr>
-        <w:pStyle w:val="BodyText"/>
-        <w:spacing w:line="237" w:lineRule="auto"/>
-        <w:ind w:right="318"/>
-      </w:pPr>
-    </w:p>
-    <w:p>
-      <w:pPr>
-        <w:pStyle w:val="BodyText"/>
-        <w:spacing w:after="240" w:line="237" w:lineRule="auto"/>
-        <w:ind w:right="318"/>
-        <w:rPr>
-          <w:b/>
-          <w:bCs/>
-        </w:rPr>
-      </w:pPr>
-      <w:r>
-        <w:rPr>
-          <w:b/>
-          <w:bCs/>
-        </w:rPr>
-        <w:t>Automation &amp; Workflow Engineering (n8n)</w:t>
+        <w:t>Architecture</w:t>
       </w:r>
     </w:p>
     <w:p>
@@ -1906,9 +1569,18 @@
           <w:numId w:val="5"/>
         </w:numPr>
         <w:ind w:right="318"/>
-      </w:pPr>
-      <w:r>
-        <w:t>Designed and deployed multi-step automation workflows using n8n.</w:t>
+        <w:jc w:val="both"/>
+      </w:pPr>
+      <w:r>
+        <w:t xml:space="preserve">Designed multi-step automation workflows using n8n (webhooks &amp; </w:t>
+      </w:r>
+      <w:proofErr w:type="spellStart"/>
+      <w:r>
+        <w:t>cron</w:t>
+      </w:r>
+      <w:proofErr w:type="spellEnd"/>
+      <w:r>
+        <w:t xml:space="preserve"> triggers).</w:t>
       </w:r>
     </w:p>
     <w:p>
@@ -1919,17 +1591,10 @@
           <w:numId w:val="5"/>
         </w:numPr>
         <w:ind w:right="318"/>
-      </w:pPr>
-      <w:r>
-        <w:t xml:space="preserve">Built webhook-based and </w:t>
-      </w:r>
-      <w:proofErr w:type="spellStart"/>
-      <w:r>
-        <w:t>cron</w:t>
-      </w:r>
-      <w:proofErr w:type="spellEnd"/>
-      <w:r>
-        <w:t>-triggered automation systems.</w:t>
+        <w:jc w:val="both"/>
+      </w:pPr>
+      <w:r>
+        <w:t>Integrated third-party APIs using OAuth, API keys, and secure tokens.</w:t>
       </w:r>
     </w:p>
     <w:p>
@@ -1940,9 +1605,18 @@
           <w:numId w:val="5"/>
         </w:numPr>
         <w:ind w:right="318"/>
-      </w:pPr>
-      <w:r>
-        <w:t>Integrated third-party APIs using OAuth, API keys, and Bearer tokens.</w:t>
+        <w:jc w:val="both"/>
+      </w:pPr>
+      <w:r>
+        <w:t xml:space="preserve">Built CRM synchronization and data </w:t>
+      </w:r>
+      <w:proofErr w:type="spellStart"/>
+      <w:r>
+        <w:t>upsert</w:t>
+      </w:r>
+      <w:proofErr w:type="spellEnd"/>
+      <w:r>
+        <w:t xml:space="preserve"> pipelines.</w:t>
       </w:r>
     </w:p>
     <w:p>
@@ -1953,124 +1627,10 @@
           <w:numId w:val="5"/>
         </w:numPr>
         <w:ind w:right="318"/>
-      </w:pPr>
-      <w:r>
-        <w:t>Developed lead capture and CRM synchronization workflows.</w:t>
-      </w:r>
-    </w:p>
-    <w:p>
-      <w:pPr>
-        <w:pStyle w:val="BodyText"/>
-        <w:numPr>
-          <w:ilvl w:val="0"/>
-          <w:numId w:val="5"/>
-        </w:numPr>
-        <w:ind w:right="318"/>
-      </w:pPr>
-      <w:r>
-        <w:t xml:space="preserve">Implemented data extraction, transformation, and </w:t>
-      </w:r>
-      <w:proofErr w:type="spellStart"/>
-      <w:r>
-        <w:t>upsert</w:t>
-      </w:r>
-      <w:proofErr w:type="spellEnd"/>
-      <w:r>
-        <w:t xml:space="preserve"> logic.</w:t>
-      </w:r>
-    </w:p>
-    <w:p>
-      <w:pPr>
-        <w:pStyle w:val="BodyText"/>
-        <w:numPr>
-          <w:ilvl w:val="0"/>
-          <w:numId w:val="5"/>
-        </w:numPr>
-        <w:ind w:right="318"/>
-      </w:pPr>
-      <w:r>
-        <w:t>Built email notification and conversion tracking automations.</w:t>
-      </w:r>
-    </w:p>
-    <w:p>
-      <w:pPr>
-        <w:pStyle w:val="BodyText"/>
-        <w:numPr>
-          <w:ilvl w:val="0"/>
-          <w:numId w:val="5"/>
-        </w:numPr>
-        <w:ind w:right="318"/>
-      </w:pPr>
-      <w:r>
-        <w:t>Configured production-ready n8n instances on Linux servers.</w:t>
-      </w:r>
-    </w:p>
-    <w:p>
-      <w:pPr>
-        <w:pStyle w:val="BodyText"/>
-        <w:spacing w:after="240" w:line="237" w:lineRule="auto"/>
-        <w:ind w:right="318"/>
-        <w:rPr>
-          <w:b/>
-          <w:bCs/>
-        </w:rPr>
-      </w:pPr>
-    </w:p>
-    <w:p>
-      <w:pPr>
-        <w:pStyle w:val="BodyText"/>
-        <w:spacing w:after="240" w:line="237" w:lineRule="auto"/>
-        <w:ind w:right="318"/>
-        <w:rPr>
-          <w:b/>
-          <w:bCs/>
-        </w:rPr>
-      </w:pPr>
-      <w:r>
-        <w:rPr>
-          <w:b/>
-          <w:bCs/>
-        </w:rPr>
-        <w:t>Bot Deployment</w:t>
-      </w:r>
-    </w:p>
-    <w:p>
-      <w:pPr>
-        <w:pStyle w:val="BodyText"/>
-        <w:numPr>
-          <w:ilvl w:val="0"/>
-          <w:numId w:val="4"/>
-        </w:numPr>
-        <w:ind w:right="318"/>
-      </w:pPr>
-      <w:r>
-        <w:t>Developed API-driven automation bots with session handling.</w:t>
-      </w:r>
-    </w:p>
-    <w:p>
-      <w:pPr>
-        <w:pStyle w:val="BodyText"/>
-        <w:numPr>
-          <w:ilvl w:val="0"/>
-          <w:numId w:val="4"/>
-        </w:numPr>
-        <w:ind w:right="318"/>
-      </w:pPr>
-      <w:r>
-        <w:t>Built event-driven bots using webhooks and backend logic.</w:t>
-      </w:r>
-    </w:p>
-    <w:p>
-      <w:pPr>
-        <w:pStyle w:val="BodyText"/>
-        <w:numPr>
-          <w:ilvl w:val="0"/>
-          <w:numId w:val="4"/>
-        </w:numPr>
-        <w:ind w:right="318"/>
-      </w:pPr>
-      <w:r>
-        <w:t>Automated social media data extraction and posting workflows.</w:t>
+        <w:jc w:val="both"/>
+      </w:pPr>
+      <w:r>
+        <w:t>Deployed production-ready automation systems on Linux servers.</w:t>
       </w:r>
     </w:p>
     <w:p>
@@ -2115,6 +1675,14 @@
                 <w:bCs/>
                 <w:sz w:val="24"/>
               </w:rPr>
+              <w:t xml:space="preserve">TECHNICAL </w:t>
+            </w:r>
+            <w:r>
+              <w:rPr>
+                <w:b/>
+                <w:bCs/>
+                <w:sz w:val="24"/>
+              </w:rPr>
               <w:t>SKILLS</w:t>
             </w:r>
           </w:p>
@@ -2136,6 +1704,7 @@
       <w:pPr>
         <w:pStyle w:val="BodyText"/>
         <w:ind w:right="318"/>
+        <w:jc w:val="both"/>
       </w:pPr>
       <w:r>
         <w:rPr>
@@ -2145,19 +1714,26 @@
         <w:t xml:space="preserve">Languages: </w:t>
       </w:r>
       <w:r>
-        <w:t>JavaScript, TypeScript, Java (Spring Boot),</w:t>
-      </w:r>
-      <w:r>
-        <w:t xml:space="preserve"> C,</w:t>
-      </w:r>
-      <w:r>
-        <w:t xml:space="preserve"> C++, SQL</w:t>
+        <w:t>JavaScript, TypeScript, Java,</w:t>
+      </w:r>
+      <w:r>
+        <w:t xml:space="preserve"> C</w:t>
+      </w:r>
+      <w:r>
+        <w:t>/</w:t>
+      </w:r>
+      <w:r>
+        <w:t>C++, SQL</w:t>
+      </w:r>
+      <w:r>
+        <w:t>.</w:t>
       </w:r>
     </w:p>
     <w:p>
       <w:pPr>
         <w:pStyle w:val="BodyText"/>
         <w:ind w:right="318"/>
+        <w:jc w:val="both"/>
         <w:rPr>
           <w:b/>
           <w:bCs/>
@@ -2171,13 +1747,23 @@
         <w:t xml:space="preserve">Frontend: </w:t>
       </w:r>
       <w:r>
-        <w:t>React.js, Next.js, Tailwind CSS, Responsive Design, Server-Side Rendering (SSR), Component-Based Architecture</w:t>
+        <w:t>React.js, Next.js, Tailwind CSS</w:t>
+      </w:r>
+      <w:r>
+        <w:t xml:space="preserve">, </w:t>
+      </w:r>
+      <w:r>
+        <w:t>SSR</w:t>
+      </w:r>
+      <w:r>
+        <w:t>.</w:t>
       </w:r>
     </w:p>
     <w:p>
       <w:pPr>
         <w:pStyle w:val="BodyText"/>
         <w:ind w:right="318"/>
+        <w:jc w:val="both"/>
       </w:pPr>
       <w:r>
         <w:rPr>
@@ -2187,13 +1773,17 @@
         <w:t xml:space="preserve">Backend: </w:t>
       </w:r>
       <w:r>
-        <w:t>Node.js, Express.js, Spring Boot, REST API Development, JWT Authentication, Role-Based Access Control (RBAC), Middleware Architecture</w:t>
+        <w:t>Node.js, Express, Spring Boot, REST APIs, JWT, RBAC</w:t>
+      </w:r>
+      <w:r>
+        <w:t>.</w:t>
       </w:r>
     </w:p>
     <w:p>
       <w:pPr>
         <w:pStyle w:val="BodyText"/>
         <w:ind w:right="318"/>
+        <w:jc w:val="both"/>
         <w:rPr>
           <w:b/>
           <w:bCs/>
@@ -2204,47 +1794,55 @@
           <w:b/>
           <w:bCs/>
         </w:rPr>
-        <w:t>Automation:</w:t>
-      </w:r>
-      <w:r>
-        <w:t xml:space="preserve"> </w:t>
-      </w:r>
-      <w:r>
-        <w:t>n8n, API Integrations, Webhooks, Cron Jobs</w:t>
+        <w:t xml:space="preserve">Databases: </w:t>
+      </w:r>
+      <w:r>
+        <w:t xml:space="preserve">MongoDB, PostgreSQL, MySQL, Redis, </w:t>
+      </w:r>
+      <w:proofErr w:type="spellStart"/>
+      <w:r>
+        <w:t>Supabase</w:t>
+      </w:r>
+      <w:proofErr w:type="spellEnd"/>
+      <w:r>
+        <w:t>.</w:t>
       </w:r>
     </w:p>
     <w:p>
       <w:pPr>
         <w:pStyle w:val="BodyText"/>
         <w:ind w:right="318"/>
+        <w:jc w:val="both"/>
+      </w:pPr>
+      <w:r>
         <w:rPr>
           <w:b/>
           <w:bCs/>
         </w:rPr>
-      </w:pPr>
+        <w:t>Cloud</w:t>
+      </w:r>
       <w:r>
         <w:rPr>
           <w:b/>
           <w:bCs/>
         </w:rPr>
-        <w:t xml:space="preserve">Databases: </w:t>
-      </w:r>
-      <w:r>
-        <w:t xml:space="preserve">MongoDB, MySQL, PostgreSQL, Redis, Firebase, </w:t>
-      </w:r>
-      <w:proofErr w:type="spellStart"/>
-      <w:r>
-        <w:t>Supabase</w:t>
-      </w:r>
-      <w:proofErr w:type="spellEnd"/>
-      <w:r>
-        <w:t>, Database Indexing, Query Optimization</w:t>
+        <w:t>:</w:t>
+      </w:r>
+      <w:r>
+        <w:t xml:space="preserve"> </w:t>
+      </w:r>
+      <w:r>
+        <w:t>AWS EC2, Ubuntu, Nginx, PM2, SSL, DNS</w:t>
+      </w:r>
+      <w:r>
+        <w:t>.</w:t>
       </w:r>
     </w:p>
     <w:p>
       <w:pPr>
         <w:pStyle w:val="BodyText"/>
         <w:ind w:right="318"/>
+        <w:jc w:val="both"/>
         <w:rPr>
           <w:b/>
           <w:bCs/>
@@ -2255,16 +1853,23 @@
           <w:b/>
           <w:bCs/>
         </w:rPr>
-        <w:t xml:space="preserve">Cloud &amp; DevOps: </w:t>
-      </w:r>
-      <w:r>
-        <w:t>AWS EC2, Ubuntu Server Administration, Nginx Reverse Proxy, PM2, SSL, DNS Configuration, Deployment Pipelines, Environment Management</w:t>
+        <w:t>Automation:</w:t>
+      </w:r>
+      <w:r>
+        <w:t xml:space="preserve"> </w:t>
+      </w:r>
+      <w:r>
+        <w:t>n8n, API Integrations, Webhooks, Cron Jobs</w:t>
+      </w:r>
+      <w:r>
+        <w:t>.</w:t>
       </w:r>
     </w:p>
     <w:p>
       <w:pPr>
         <w:pStyle w:val="BodyText"/>
         <w:ind w:right="318"/>
+        <w:jc w:val="both"/>
       </w:pPr>
       <w:r>
         <w:rPr>
@@ -2274,7 +1879,10 @@
         <w:t xml:space="preserve">Security: </w:t>
       </w:r>
       <w:r>
-        <w:t>Authentication Systems, Secure HTTP Headers, Rate Limiting, CORS Configuration, Input Validation, Password Hashing, Production Optimization</w:t>
+        <w:t>Rate Limiting, CORS, Secure Headers, Password Hashing</w:t>
+      </w:r>
+      <w:r>
+        <w:t>.</w:t>
       </w:r>
     </w:p>
     <w:p>
@@ -2485,6 +2093,7 @@
           <w:ilvl w:val="0"/>
           <w:numId w:val="6"/>
         </w:numPr>
+        <w:jc w:val="both"/>
       </w:pPr>
       <w:r>
         <w:rPr>
@@ -2508,6 +2117,7 @@
           <w:ilvl w:val="0"/>
           <w:numId w:val="6"/>
         </w:numPr>
+        <w:jc w:val="both"/>
       </w:pPr>
       <w:r>
         <w:rPr>
@@ -2531,6 +2141,7 @@
           <w:ilvl w:val="0"/>
           <w:numId w:val="6"/>
         </w:numPr>
+        <w:jc w:val="both"/>
       </w:pPr>
       <w:r>
         <w:rPr>

</xml_diff>